<commit_message>
docs(brand): scope Sora to the wordmark only in the v1.2 guidelines
Update the Typography section in both the PDF and Word brand
guidelines so they match the website implementation: Sora is reserved
for the Qualivio wordmark, Space Grotesk handles every other display
surface (headings, eyebrows, card titles), and DM Sans carries the
body copy. Also update the Change Log entry to describe the actual
decision rather than the earlier global-Sora trial. Regenerate both
files into marketing/.

Co-Authored-By: Claude Opus 4.7 (1M context) <noreply@anthropic.com>
</commit_message>
<xml_diff>
--- a/marketing/Qualivio_Brand_Guidelines_v1.2.docx
+++ b/marketing/Qualivio_Brand_Guidelines_v1.2.docx
@@ -2939,7 +2939,7 @@
         <w:pStyle w:val="Heading1"/>
       </w:pPr>
       <w:r>
-        <w:t xml:space="preserve">Sora · the single brand typeface.</w:t>
+        <w:t xml:space="preserve">Three typefaces, three roles.</w:t>
       </w:r>
     </w:p>
     <w:p>
@@ -2947,7 +2947,7 @@
         <w:spacing w:after="120"/>
       </w:pPr>
       <w:r>
-        <w:t xml:space="preserve">Qualivio uses a single typeface across every brand surface — wordmark, headings, body, video, and print. The chosen family is Sora, a modern geometric sans designed by Indestructible Type Co. and licensed under the SIL Open Font License.</w:t>
+        <w:t xml:space="preserve">Qualivio uses three typefaces with strict separation. Sora is reserved exclusively for the Qualivio wordmark; Space Grotesk handles every other display surface (headings, eyebrows, card titles); DM Sans carries the body copy and form labels. This keeps the wordmark distinctive across channels.</w:t>
       </w:r>
     </w:p>
     <w:p>
@@ -2968,7 +2968,7 @@
           <w:sz w:val="18"/>
           <w:szCs w:val="18"/>
         </w:rPr>
-        <w:t xml:space="preserve">WEIGHTS IN USE</w:t>
+        <w:t xml:space="preserve">WORDMARK · SORA MEDIUM 500</w:t>
       </w:r>
     </w:p>
     <w:tbl>
@@ -2998,20 +2998,18 @@
               <w:right w:val="single" w:color="E5E4F0" w:sz="4"/>
             </w:tcBorders>
             <w:tcMar>
-              <w:top w:type="dxa" w:w="120"/>
+              <w:top w:type="dxa" w:w="200"/>
               <w:left w:type="dxa" w:w="200"/>
-              <w:bottom w:type="dxa" w:w="120"/>
+              <w:bottom w:type="dxa" w:w="200"/>
               <w:right w:type="dxa" w:w="200"/>
             </w:tcMar>
           </w:tcPr>
           <w:p>
             <w:r>
               <w:rPr>
-                <w:b w:val="false"/>
-                <w:bCs w:val="false"/>
                 <w:color w:val="0D0D0F"/>
-                <w:sz w:val="56"/>
-                <w:szCs w:val="56"/>
+                <w:sz w:val="80"/>
+                <w:szCs w:val="80"/>
               </w:rPr>
               <w:t xml:space="preserve">Qualivio</w:t>
             </w:r>
@@ -3027,9 +3025,9 @@
               <w:right w:val="single" w:color="E5E4F0" w:sz="4"/>
             </w:tcBorders>
             <w:tcMar>
-              <w:top w:type="dxa" w:w="120"/>
+              <w:top w:type="dxa" w:w="200"/>
               <w:left w:type="dxa" w:w="200"/>
-              <w:bottom w:type="dxa" w:w="120"/>
+              <w:bottom w:type="dxa" w:w="200"/>
               <w:right w:type="dxa" w:w="200"/>
             </w:tcMar>
           </w:tcPr>
@@ -3045,7 +3043,7 @@
                 <w:sz w:val="20"/>
                 <w:szCs w:val="20"/>
               </w:rPr>
-              <w:t xml:space="preserve">Sora Regular · 400</w:t>
+              <w:t xml:space="preserve">Used only for the brand wordmark.</w:t>
             </w:r>
           </w:p>
           <w:p>
@@ -3054,7 +3052,7 @@
                 <w:sz w:val="18"/>
                 <w:szCs w:val="18"/>
               </w:rPr>
-              <w:t xml:space="preserve">Body copy, long-form text</w:t>
+              <w:t xml:space="preserve">Website Header &amp; Footer, /intro MP4, LinkedIn banner, printed materials.</w:t>
             </w:r>
           </w:p>
         </w:tc>
@@ -3062,195 +3060,7 @@
     </w:tbl>
     <w:p>
       <w:pPr>
-        <w:spacing w:after="100"/>
-      </w:pPr>
-    </w:p>
-    <w:tbl>
-      <w:tblPr>
-        <w:tblW w:type="dxa" w:w="9360"/>
-        <w:tblBorders>
-          <w:top w:val="single" w:color="auto" w:sz="4"/>
-          <w:left w:val="single" w:color="auto" w:sz="4"/>
-          <w:bottom w:val="single" w:color="auto" w:sz="4"/>
-          <w:right w:val="single" w:color="auto" w:sz="4"/>
-          <w:insideH w:val="single" w:color="auto" w:sz="4"/>
-          <w:insideV w:val="single" w:color="auto" w:sz="4"/>
-        </w:tblBorders>
-      </w:tblPr>
-      <w:tblGrid>
-        <w:gridCol w:w="4680"/>
-        <w:gridCol w:w="4680"/>
-      </w:tblGrid>
-      <w:tr>
-        <w:tc>
-          <w:tcPr>
-            <w:tcW w:type="dxa" w:w="4680"/>
-            <w:tcBorders>
-              <w:top w:val="single" w:color="E5E4F0" w:sz="4"/>
-              <w:left w:val="single" w:color="E5E4F0" w:sz="4"/>
-              <w:bottom w:val="single" w:color="E5E4F0" w:sz="4"/>
-              <w:right w:val="single" w:color="E5E4F0" w:sz="4"/>
-            </w:tcBorders>
-            <w:tcMar>
-              <w:top w:type="dxa" w:w="120"/>
-              <w:left w:type="dxa" w:w="200"/>
-              <w:bottom w:type="dxa" w:w="120"/>
-              <w:right w:type="dxa" w:w="200"/>
-            </w:tcMar>
-          </w:tcPr>
-          <w:p>
-            <w:r>
-              <w:rPr>
-                <w:b w:val="false"/>
-                <w:bCs w:val="false"/>
-                <w:color w:val="0D0D0F"/>
-                <w:sz w:val="56"/>
-                <w:szCs w:val="56"/>
-              </w:rPr>
-              <w:t xml:space="preserve">Qualivio</w:t>
-            </w:r>
-          </w:p>
-        </w:tc>
-        <w:tc>
-          <w:tcPr>
-            <w:tcW w:type="dxa" w:w="4680"/>
-            <w:tcBorders>
-              <w:top w:val="single" w:color="E5E4F0" w:sz="4"/>
-              <w:left w:val="single" w:color="E5E4F0" w:sz="4"/>
-              <w:bottom w:val="single" w:color="E5E4F0" w:sz="4"/>
-              <w:right w:val="single" w:color="E5E4F0" w:sz="4"/>
-            </w:tcBorders>
-            <w:tcMar>
-              <w:top w:type="dxa" w:w="120"/>
-              <w:left w:type="dxa" w:w="200"/>
-              <w:bottom w:type="dxa" w:w="120"/>
-              <w:right w:type="dxa" w:w="200"/>
-            </w:tcMar>
-          </w:tcPr>
-          <w:p>
-            <w:pPr>
-              <w:spacing w:after="80"/>
-            </w:pPr>
-            <w:r>
-              <w:rPr>
-                <w:b/>
-                <w:bCs/>
-                <w:color w:val="7C6AF7"/>
-                <w:sz w:val="20"/>
-                <w:szCs w:val="20"/>
-              </w:rPr>
-              <w:t xml:space="preserve">Sora Medium · 500</w:t>
-            </w:r>
-          </w:p>
-          <w:p>
-            <w:r>
-              <w:rPr>
-                <w:sz w:val="18"/>
-                <w:szCs w:val="18"/>
-              </w:rPr>
-              <w:t xml:space="preserve">Wordmark, eyebrows, callouts</w:t>
-            </w:r>
-          </w:p>
-        </w:tc>
-      </w:tr>
-    </w:tbl>
-    <w:p>
-      <w:pPr>
-        <w:spacing w:after="100"/>
-      </w:pPr>
-    </w:p>
-    <w:tbl>
-      <w:tblPr>
-        <w:tblW w:type="dxa" w:w="9360"/>
-        <w:tblBorders>
-          <w:top w:val="single" w:color="auto" w:sz="4"/>
-          <w:left w:val="single" w:color="auto" w:sz="4"/>
-          <w:bottom w:val="single" w:color="auto" w:sz="4"/>
-          <w:right w:val="single" w:color="auto" w:sz="4"/>
-          <w:insideH w:val="single" w:color="auto" w:sz="4"/>
-          <w:insideV w:val="single" w:color="auto" w:sz="4"/>
-        </w:tblBorders>
-      </w:tblPr>
-      <w:tblGrid>
-        <w:gridCol w:w="4680"/>
-        <w:gridCol w:w="4680"/>
-      </w:tblGrid>
-      <w:tr>
-        <w:tc>
-          <w:tcPr>
-            <w:tcW w:type="dxa" w:w="4680"/>
-            <w:tcBorders>
-              <w:top w:val="single" w:color="E5E4F0" w:sz="4"/>
-              <w:left w:val="single" w:color="E5E4F0" w:sz="4"/>
-              <w:bottom w:val="single" w:color="E5E4F0" w:sz="4"/>
-              <w:right w:val="single" w:color="E5E4F0" w:sz="4"/>
-            </w:tcBorders>
-            <w:tcMar>
-              <w:top w:type="dxa" w:w="120"/>
-              <w:left w:type="dxa" w:w="200"/>
-              <w:bottom w:type="dxa" w:w="120"/>
-              <w:right w:type="dxa" w:w="200"/>
-            </w:tcMar>
-          </w:tcPr>
-          <w:p>
-            <w:r>
-              <w:rPr>
-                <w:b/>
-                <w:bCs/>
-                <w:color w:val="0D0D0F"/>
-                <w:sz w:val="56"/>
-                <w:szCs w:val="56"/>
-              </w:rPr>
-              <w:t xml:space="preserve">Qualivio</w:t>
-            </w:r>
-          </w:p>
-        </w:tc>
-        <w:tc>
-          <w:tcPr>
-            <w:tcW w:type="dxa" w:w="4680"/>
-            <w:tcBorders>
-              <w:top w:val="single" w:color="E5E4F0" w:sz="4"/>
-              <w:left w:val="single" w:color="E5E4F0" w:sz="4"/>
-              <w:bottom w:val="single" w:color="E5E4F0" w:sz="4"/>
-              <w:right w:val="single" w:color="E5E4F0" w:sz="4"/>
-            </w:tcBorders>
-            <w:tcMar>
-              <w:top w:type="dxa" w:w="120"/>
-              <w:left w:type="dxa" w:w="200"/>
-              <w:bottom w:type="dxa" w:w="120"/>
-              <w:right w:type="dxa" w:w="200"/>
-            </w:tcMar>
-          </w:tcPr>
-          <w:p>
-            <w:pPr>
-              <w:spacing w:after="80"/>
-            </w:pPr>
-            <w:r>
-              <w:rPr>
-                <w:b/>
-                <w:bCs/>
-                <w:color w:val="7C6AF7"/>
-                <w:sz w:val="20"/>
-                <w:szCs w:val="20"/>
-              </w:rPr>
-              <w:t xml:space="preserve">Sora Bold · 700</w:t>
-            </w:r>
-          </w:p>
-          <w:p>
-            <w:r>
-              <w:rPr>
-                <w:sz w:val="18"/>
-                <w:szCs w:val="18"/>
-              </w:rPr>
-              <w:t xml:space="preserve">Headings, emphasis</w:t>
-            </w:r>
-          </w:p>
-        </w:tc>
-      </w:tr>
-    </w:tbl>
-    <w:p>
-      <w:pPr>
-        <w:spacing w:after="100"/>
+        <w:spacing w:after="240"/>
       </w:pPr>
     </w:p>
     <w:p>
@@ -3266,43 +3076,30 @@
           <w:sz w:val="18"/>
           <w:szCs w:val="18"/>
         </w:rPr>
-        <w:t xml:space="preserve">WEBSITE FONT STACK</w:t>
-      </w:r>
-    </w:p>
-    <w:p>
-      <w:pPr>
-        <w:pStyle w:val="ListParagraph"/>
-        <w:numPr>
-          <w:ilvl w:val="0"/>
-          <w:numId w:val="2"/>
-        </w:numPr>
-      </w:pPr>
-      <w:r>
-        <w:t xml:space="preserve">Display + Headings: Sora (400 / 500 / 700)</w:t>
-      </w:r>
-    </w:p>
-    <w:p>
-      <w:pPr>
-        <w:pStyle w:val="ListParagraph"/>
-        <w:numPr>
-          <w:ilvl w:val="0"/>
-          <w:numId w:val="2"/>
-        </w:numPr>
-      </w:pPr>
-      <w:r>
-        <w:t xml:space="preserve">Body + Forms: DM Sans (400 / 500)</w:t>
-      </w:r>
-    </w:p>
-    <w:p>
-      <w:pPr>
-        <w:pStyle w:val="ListParagraph"/>
-        <w:numPr>
-          <w:ilvl w:val="0"/>
-          <w:numId w:val="2"/>
-        </w:numPr>
-      </w:pPr>
-      <w:r>
-        <w:t xml:space="preserve">Code samples: monospaced system stack</w:t>
+        <w:t xml:space="preserve">DISPLAY · SPACE GROTESK</w:t>
+      </w:r>
+    </w:p>
+    <w:p>
+      <w:pPr>
+        <w:spacing w:after="100"/>
+      </w:pPr>
+      <w:r>
+        <w:rPr>
+          <w:b/>
+          <w:bCs/>
+          <w:color w:val="0D0D0F"/>
+          <w:sz w:val="32"/>
+          <w:szCs w:val="32"/>
+        </w:rPr>
+        <w:t xml:space="preserve">Clear thinking for complex regulations.</w:t>
+      </w:r>
+    </w:p>
+    <w:p>
+      <w:pPr>
+        <w:spacing w:after="120"/>
+      </w:pPr>
+      <w:r>
+        <w:t xml:space="preserve">Used for H1–H6, section eyebrows, card titles, and any heading-level display element. Weights 400 / 500 / 700.</w:t>
       </w:r>
     </w:p>
     <w:p>
@@ -3323,6 +3120,48 @@
           <w:sz w:val="18"/>
           <w:szCs w:val="18"/>
         </w:rPr>
+        <w:t xml:space="preserve">BODY · DM SANS</w:t>
+      </w:r>
+    </w:p>
+    <w:p>
+      <w:pPr>
+        <w:spacing w:after="100"/>
+      </w:pPr>
+      <w:r>
+        <w:rPr>
+          <w:color w:val="0D0D0F"/>
+          <w:sz w:val="22"/>
+          <w:szCs w:val="22"/>
+        </w:rPr>
+        <w:t xml:space="preserve">Trusted insights, education and consulting for life sciences.</w:t>
+      </w:r>
+    </w:p>
+    <w:p>
+      <w:pPr>
+        <w:spacing w:after="120"/>
+      </w:pPr>
+      <w:r>
+        <w:t xml:space="preserve">Used for paragraphs, form fields, button labels, and captions. Weights 400 / 500.</w:t>
+      </w:r>
+    </w:p>
+    <w:p>
+      <w:pPr>
+        <w:spacing w:after="240"/>
+      </w:pPr>
+    </w:p>
+    <w:p>
+      <w:pPr>
+        <w:spacing w:after="100" w:before="240"/>
+      </w:pPr>
+      <w:r>
+        <w:rPr>
+          <w:b/>
+          <w:bCs/>
+          <w:color w:val="7C6AF7"/>
+          <w:spacing w:val="50"/>
+          <w:sz w:val="18"/>
+          <w:szCs w:val="18"/>
+        </w:rPr>
         <w:t xml:space="preserve">CROSS-CHANNEL CONSISTENCY</w:t>
       </w:r>
     </w:p>
@@ -3331,7 +3170,7 @@
         <w:spacing w:after="120"/>
       </w:pPr>
       <w:r>
-        <w:t xml:space="preserve">Sora must be used for the Qualivio wordmark in every channel: website, /intro MP4, LinkedIn banner, social posts, presentations, and print. Fallbacks (Inter, Arial) are permitted only when Sora cannot be loaded; never substitute by choice.</w:t>
+        <w:t xml:space="preserve">Sora is the wordmark font and only that. Never set headings or body copy in Sora. Conversely, never set the Qualivio wordmark in Space Grotesk or DM Sans. Fallbacks (Inter, Arial) are permitted only when Sora cannot be loaded; never substitute by choice.</w:t>
       </w:r>
     </w:p>
     <w:p>
@@ -3728,19 +3567,19 @@
         </w:numPr>
       </w:pPr>
       <w:r>
-        <w:t xml:space="preserve">Switched the brand display typeface to Sora (Medium 500 for wordmark, Bold 700 for headings).</w:t>
-      </w:r>
-    </w:p>
-    <w:p>
-      <w:pPr>
-        <w:pStyle w:val="ListParagraph"/>
-        <w:numPr>
-          <w:ilvl w:val="0"/>
-          <w:numId w:val="2"/>
-        </w:numPr>
-      </w:pPr>
-      <w:r>
-        <w:t xml:space="preserve">Added a Typography section documenting weights and cross-channel consistency.</w:t>
+        <w:t xml:space="preserve">Introduced Sora Medium 500 as a dedicated wordmark font; Space Grotesk remains the display typeface for all other headings.</w:t>
+      </w:r>
+    </w:p>
+    <w:p>
+      <w:pPr>
+        <w:pStyle w:val="ListParagraph"/>
+        <w:numPr>
+          <w:ilvl w:val="0"/>
+          <w:numId w:val="2"/>
+        </w:numPr>
+      </w:pPr>
+      <w:r>
+        <w:t xml:space="preserve">Added a Typography section documenting the three-font stack (Sora for wordmark, Space Grotesk for display, DM Sans for body).</w:t>
       </w:r>
     </w:p>
     <w:p>

</xml_diff>